<commit_message>
Fix broken header/footer section structure in MAP template asset
The previous stripping pass collapsed the document's 3-section
structure into one, which dropped the running page header
(Client | Marketing Action Plan | page N) and the branded contact-bar
footer from all content pages - only the cover page rendered
correctly. Rebuilt by properly preserving the section break between
the cover (header1/footer1) and content (header2/footer1) sections
instead of wiping all body content indiscriminately. Validated via
OOXML schema validation and confirmed still fully scrubbed of the
source client's data.
</commit_message>
<xml_diff>
--- a/.claude/skills/marketing-action-plan/assets/PG-MAP-reference-template.docx
+++ b/.claude/skills/marketing-action-plan/assets/PG-MAP-reference-template.docx
@@ -3,51 +3,471 @@
 <w:document xmlns:wpc="http://schemas.microsoft.com/office/word/2010/wordprocessingCanvas" xmlns:cx="http://schemas.microsoft.com/office/drawing/2014/chartex" xmlns:cx1="http://schemas.microsoft.com/office/drawing/2015/9/8/chartex" xmlns:cx2="http://schemas.microsoft.com/office/drawing/2015/10/21/chartex" xmlns:cx3="http://schemas.microsoft.com/office/drawing/2016/5/9/chartex" xmlns:cx4="http://schemas.microsoft.com/office/drawing/2016/5/10/chartex" xmlns:cx5="http://schemas.microsoft.com/office/drawing/2016/5/11/chartex" xmlns:cx6="http://schemas.microsoft.com/office/drawing/2016/5/12/chartex" xmlns:cx7="http://schemas.microsoft.com/office/drawing/2016/5/13/chartex" xmlns:cx8="http://schemas.microsoft.com/office/drawing/2016/5/14/chartex" xmlns:mc="http://schemas.openxmlformats.org/markup-compatibility/2006" xmlns:m="http://schemas.openxmlformats.org/officeDocument/2006/math" xmlns:aink="http://schemas.microsoft.com/office/drawing/2016/ink" xmlns:am3d="http://schemas.microsoft.com/office/drawing/2017/model3d" xmlns:oel="http://schemas.microsoft.com/office/2019/extlst" xmlns:r="http://schemas.openxmlformats.org/officeDocument/2006/relationships" xmlns:wp14="http://schemas.microsoft.com/office/word/2010/wordprocessingDrawing" xmlns:wp="http://schemas.openxmlformats.org/drawingml/2006/wordprocessingDrawing" xmlns:wpg="http://schemas.microsoft.com/office/word/2010/wordprocessingGroup" xmlns:wpi="http://schemas.microsoft.com/office/word/2010/wordprocessingInk" xmlns:wps="http://schemas.microsoft.com/office/word/2010/wordprocessingShape" xmlns:o="urn:schemas-microsoft-com:office:office" xmlns:v="urn:schemas-microsoft-com:vml" xmlns:w10="urn:schemas-microsoft-com:office:word" xmlns:w="http://schemas.openxmlformats.org/wordprocessingml/2006/main" xmlns:w14="http://schemas.microsoft.com/office/word/2010/wordml" xmlns:w15="http://schemas.microsoft.com/office/word/2012/wordml" xmlns:w16cei="http://schemas.microsoft.com/office/word/2026/wordml/cei" xmlns:w16cex="http://schemas.microsoft.com/office/word/2018/wordml/cex" xmlns:w16cid="http://schemas.microsoft.com/office/word/2016/wordml/cid" xmlns:w16="http://schemas.microsoft.com/office/word/2018/wordml" xmlns:w16sdtdh="http://schemas.microsoft.com/office/word/2020/wordml/sdtdatahash" xmlns:w16sdtfl="http://schemas.microsoft.com/office/word/2024/wordml/sdtformatlock" xmlns:w16se="http://schemas.microsoft.com/office/word/2015/wordml/symex" xmlns:w16du="http://schemas.microsoft.com/office/word/2023/wordml/word16du" xmlns:wne="http://schemas.microsoft.com/office/word/2006/wordml" mc:Ignorable="w14 w15 w16se w16cid w16 w16cex w16sdtdh w16sdtfl w16du wp14">
   <w:body>
     <w:p>
-      <w:pPr>
-        <w:pStyle w:val="PGHeading1"/>
-      </w:pPr>
       <w:r>
-        <w:t>Marketing Action Plan — Style Reference Template</w:t>
+        <w:tab/>
+      </w:r>
+      <w:r>
+        <w:tab/>
+      </w:r>
+      <w:r>
+        <w:tab/>
+      </w:r>
+      <w:r>
+        <w:tab/>
+      </w:r>
+      <w:r>
+        <w:tab/>
       </w:r>
     </w:p>
     <w:p>
-      <w:pPr>
-        <w:pStyle w:val="PGBodycopy"/>
-      </w:pPr>
       <w:r>
-        <w:t>This is a stripped, style-only reference version of a real Purple Giraffe Marketing Action Plan. All client-specific content (business detail, audit findings, SWOT, competitor analysis, KPI targets, personas) has been removed. What remains demonstrates every named paragraph, heading, table, and callout-box style used in a real delivered MAP, plus the page header/footer and cover layout. Do not send this file to a client — use it only as a formatting reference when building a new MAP.</w:t>
+        <w:rPr>
+          <w:rFonts w:ascii="Arial" w:hAnsi="Arial"/>
+          <w:b/>
+          <w:color w:val="2E1A47"/>
+          <w:sz w:val="28"/>
+        </w:rPr>
+        <w:t>[Client Logo]</w:t>
       </w:r>
     </w:p>
     <w:p>
       <w:pPr>
-        <w:pStyle w:val="PGBodycopy"/>
+        <w:rPr>
+          <w:rFonts w:ascii="Nordique Pro" w:hAnsi="Nordique Pro"/>
+        </w:rPr>
+      </w:pPr>
+    </w:p>
+    <w:p>
+      <w:pPr>
+        <w:rPr>
+          <w:rFonts w:ascii="Nordique Pro" w:hAnsi="Nordique Pro"/>
+        </w:rPr>
+      </w:pPr>
+    </w:p>
+    <w:p>
+      <w:pPr>
+        <w:rPr>
+          <w:rFonts w:ascii="Nordique Pro" w:hAnsi="Nordique Pro"/>
+        </w:rPr>
+      </w:pPr>
+    </w:p>
+    <w:p>
+      <w:pPr>
+        <w:rPr>
+          <w:rFonts w:ascii="Nordique Pro" w:hAnsi="Nordique Pro"/>
+        </w:rPr>
+      </w:pPr>
+    </w:p>
+    <w:p>
+      <w:pPr>
+        <w:rPr>
+          <w:rFonts w:ascii="Nordique Pro" w:hAnsi="Nordique Pro" w:cs="Arial"/>
+          <w:b/>
+          <w:color w:val="000000"/>
+          <w:sz w:val="15"/>
+          <w:szCs w:val="15"/>
+          <w:lang w:eastAsia="en-AU"/>
+        </w:rPr>
+      </w:pPr>
+    </w:p>
+    <w:p>
+      <w:pPr>
+        <w:rPr>
+          <w:rFonts w:ascii="Nordique Pro" w:hAnsi="Nordique Pro"/>
+          <w:bdr w:val="none" w:sz="0" w:space="0" w:color="auto" w:frame="1"/>
+          <w:lang w:eastAsia="en-AU"/>
+        </w:rPr>
+      </w:pPr>
+    </w:p>
+    <w:p>
+      <w:pPr>
+        <w:rPr>
+          <w:bdr w:val="none" w:sz="0" w:space="0" w:color="auto" w:frame="1"/>
+        </w:rPr>
+      </w:pPr>
+    </w:p>
+    <w:p>
+      <w:pPr>
+        <w:rPr>
+          <w:rFonts w:ascii="Nordique Pro" w:hAnsi="Nordique Pro"/>
+          <w:bdr w:val="none" w:sz="0" w:space="0" w:color="auto" w:frame="1"/>
+          <w:lang w:eastAsia="en-AU"/>
+        </w:rPr>
+      </w:pPr>
+    </w:p>
+    <w:p>
+      <w:pPr>
+        <w:rPr>
+          <w:rFonts w:ascii="Nordique Pro" w:hAnsi="Nordique Pro"/>
+          <w:bdr w:val="none" w:sz="0" w:space="0" w:color="auto" w:frame="1"/>
+          <w:lang w:eastAsia="en-AU"/>
+        </w:rPr>
+      </w:pPr>
+    </w:p>
+    <w:p>
+      <w:pPr>
+        <w:rPr>
+          <w:rFonts w:ascii="Nordique Pro" w:hAnsi="Nordique Pro"/>
+          <w:bdr w:val="none" w:sz="0" w:space="0" w:color="auto" w:frame="1"/>
+          <w:lang w:eastAsia="en-AU"/>
+        </w:rPr>
+      </w:pPr>
+    </w:p>
+    <w:p>
+      <w:pPr>
+        <w:rPr>
+          <w:rFonts w:ascii="Nordique Pro" w:hAnsi="Nordique Pro" w:cs="Arial"/>
+          <w:b/>
+          <w:color w:val="3A3B3F"/>
+          <w:sz w:val="35"/>
+          <w:szCs w:val="35"/>
+          <w:bdr w:val="none" w:sz="0" w:space="0" w:color="auto" w:frame="1"/>
+          <w:lang w:eastAsia="en-AU"/>
+        </w:rPr>
+      </w:pPr>
+    </w:p>
+    <w:p>
+      <w:pPr>
+        <w:rPr>
+          <w:rFonts w:ascii="Nordique Pro" w:hAnsi="Nordique Pro" w:cs="Arial"/>
+          <w:b/>
+          <w:color w:val="3A3B3F"/>
+          <w:sz w:val="35"/>
+          <w:szCs w:val="35"/>
+          <w:bdr w:val="none" w:sz="0" w:space="0" w:color="auto" w:frame="1"/>
+          <w:lang w:eastAsia="en-AU"/>
+        </w:rPr>
       </w:pPr>
       <w:r>
-        <w:t>[Client Name] | Marketing Action Plan | [Month Year]</w:t>
+        <w:rPr>
+          <w:rFonts w:ascii="Nordique Pro" w:hAnsi="Nordique Pro" w:cs="Arial"/>
+          <w:color w:val="3A3B3F"/>
+          <w:sz w:val="35"/>
+          <w:szCs w:val="35"/>
+          <w:bdr w:val="none" w:sz="0" w:space="0" w:color="auto" w:frame="1"/>
+          <w:lang w:eastAsia="en-AU"/>
+        </w:rPr>
+        <w:t xml:space="preserve">     </w:t>
       </w:r>
     </w:p>
     <w:p>
       <w:pPr>
-        <w:pStyle w:val="PGHeading1"/>
+        <w:rPr>
+          <w:rFonts w:ascii="Nordique Pro" w:hAnsi="Nordique Pro"/>
+          <w:b/>
+        </w:rPr>
+      </w:pPr>
+    </w:p>
+    <w:p>
+      <w:pPr>
+        <w:rPr>
+          <w:rFonts w:ascii="Nordique Pro" w:hAnsi="Nordique Pro" w:cs="Arial"/>
+          <w:b/>
+          <w:color w:val="3A3B3F"/>
+          <w:lang w:eastAsia="en-AU"/>
+        </w:rPr>
       </w:pPr>
       <w:r>
-        <w:t>Example Section (PG Heading 1)</w:t>
+        <w:rPr>
+          <w:rFonts w:ascii="Nordique Pro" w:hAnsi="Nordique Pro" w:cs="Arial"/>
+          <w:color w:val="3A3B3F"/>
+          <w:bdr w:val="none" w:sz="0" w:space="0" w:color="auto" w:frame="1"/>
+          <w:lang w:eastAsia="en-AU"/>
+        </w:rPr>
+        <w:t xml:space="preserve">                                    </w:t>
       </w:r>
     </w:p>
     <w:p>
       <w:pPr>
-        <w:pStyle w:val="PGHeading2"/>
-      </w:pPr>
+        <w:rPr>
+          <w:rFonts w:ascii="Nordique Pro" w:hAnsi="Nordique Pro"/>
+          <w:noProof/>
+          <w:sz w:val="23"/>
+          <w:szCs w:val="23"/>
+        </w:rPr>
+      </w:pPr>
+    </w:p>
+    <w:p>
+      <w:pPr>
+        <w:rPr>
+          <w:rFonts w:ascii="Nordique Pro" w:hAnsi="Nordique Pro"/>
+          <w:noProof/>
+          <w:sz w:val="23"/>
+          <w:szCs w:val="23"/>
+        </w:rPr>
+      </w:pPr>
+    </w:p>
+    <w:p>
+      <w:pPr>
+        <w:rPr>
+          <w:rFonts w:ascii="Nordique Pro" w:hAnsi="Nordique Pro"/>
+          <w:noProof/>
+          <w:sz w:val="23"/>
+          <w:szCs w:val="23"/>
+        </w:rPr>
+      </w:pPr>
+    </w:p>
+    <w:p>
+      <w:pPr>
+        <w:rPr>
+          <w:rFonts w:ascii="Nordique Pro" w:hAnsi="Nordique Pro"/>
+          <w:noProof/>
+          <w:sz w:val="23"/>
+          <w:szCs w:val="23"/>
+        </w:rPr>
+      </w:pPr>
+    </w:p>
+    <w:p>
+      <w:pPr>
+        <w:rPr>
+          <w:rFonts w:ascii="Nordique Pro" w:hAnsi="Nordique Pro"/>
+          <w:noProof/>
+          <w:sz w:val="23"/>
+          <w:szCs w:val="23"/>
+        </w:rPr>
+      </w:pPr>
+    </w:p>
+    <w:p>
+      <w:pPr>
+        <w:rPr>
+          <w:rFonts w:ascii="Nordique Pro" w:hAnsi="Nordique Pro"/>
+          <w:noProof/>
+          <w:sz w:val="23"/>
+          <w:szCs w:val="23"/>
+        </w:rPr>
+      </w:pPr>
+    </w:p>
+    <w:p>
+      <w:pPr>
+        <w:rPr>
+          <w:rFonts w:ascii="Nordique Pro" w:hAnsi="Nordique Pro"/>
+          <w:noProof/>
+          <w:sz w:val="23"/>
+          <w:szCs w:val="23"/>
+        </w:rPr>
+      </w:pPr>
+      <w:bookmarkStart w:id="0" w:name="_Toc147771423"/>
       <w:r>
-        <w:t>Example Subsection (PG Heading 2)</w:t>
+        <w:rPr>
+          <w:rFonts w:ascii="Nordique Pro" w:hAnsi="Nordique Pro"/>
+          <w:noProof/>
+          <w:lang w:eastAsia="en-AU"/>
+        </w:rPr>
+        <mc:AlternateContent>
+          <mc:Choice Requires="wps">
+            <w:drawing>
+              <wp:anchor distT="0" distB="0" distL="114300" distR="114300" simplePos="0" relativeHeight="251658240" behindDoc="0" locked="0" layoutInCell="1" allowOverlap="1" wp14:anchorId="588ACA1B" wp14:editId="0DB204CF">
+                <wp:simplePos x="0" y="0"/>
+                <wp:positionH relativeFrom="column">
+                  <wp:posOffset>1798320</wp:posOffset>
+                </wp:positionH>
+                <wp:positionV relativeFrom="paragraph">
+                  <wp:posOffset>405130</wp:posOffset>
+                </wp:positionV>
+                <wp:extent cx="7551201" cy="1109272"/>
+                <wp:effectExtent l="0" t="0" r="0" b="0"/>
+                <wp:wrapNone/>
+                <wp:docPr id="1652917927" name="Text Box 1652917927"/>
+                <wp:cNvGraphicFramePr/>
+                <a:graphic xmlns:a="http://schemas.openxmlformats.org/drawingml/2006/main">
+                  <a:graphicData uri="http://schemas.microsoft.com/office/word/2010/wordprocessingShape">
+                    <wps:wsp>
+                      <wps:cNvSpPr txBox="1"/>
+                      <wps:spPr>
+                        <a:xfrm>
+                          <a:off x="0" y="0"/>
+                          <a:ext cx="7551201" cy="1109272"/>
+                        </a:xfrm>
+                        <a:prstGeom prst="rect">
+                          <a:avLst/>
+                        </a:prstGeom>
+                        <a:noFill/>
+                        <a:ln w="6350">
+                          <a:noFill/>
+                        </a:ln>
+                      </wps:spPr>
+                      <wps:txbx>
+                        <w:txbxContent>
+                          <w:p>
+                            <w:pPr>
+                              <w:spacing w:after="10"/>
+                              <w:jc w:val="right"/>
+                              <w:rPr>
+                                <w:rFonts w:ascii="Arial" w:hAnsi="Arial" w:cs="Arial"/>
+                                <w:color w:val="00B0F0"/>
+                                <w:spacing w:val="20"/>
+                                <w:lang w:val="en" w:eastAsia="en-AU"/>
+                              </w:rPr>
+                            </w:pPr>
+                            <w:r>
+                              <w:rPr>
+                                <w:rFonts w:ascii="Arial" w:hAnsi="Arial" w:cs="Arial"/>
+                                <w:color w:val="948794"/>
+                                <w:sz w:val="90"/>
+                                <w:szCs w:val="90"/>
+                              </w:rPr>
+                              <w:t>Marketing Action Plan</w:t>
+                            </w:r>
+                            <w:r>
+                              <w:rPr>
+                                <w:rFonts w:ascii="Nordique Pro" w:hAnsi="Nordique Pro"/>
+                                <w:color w:val="2E1A47"/>
+                                <w:sz w:val="90"/>
+                                <w:szCs w:val="90"/>
+                              </w:rPr>
+                              <w:br/>
+                            </w:r>
+                            <w:r>
+                              <w:rPr>
+                                <w:rFonts w:ascii="Arial" w:hAnsi="Arial" w:cs="Arial"/>
+                                <w:color w:val="000000" w:themeColor="text1"/>
+                                <w:spacing w:val="20"/>
+                                <w:lang w:val="en" w:eastAsia="en-AU"/>
+                              </w:rPr>
+                              <w:t>April</w:t>
+                            </w:r>
+                            <w:r>
+                              <w:rPr>
+                                <w:rFonts w:ascii="Arial" w:hAnsi="Arial" w:cs="Arial"/>
+                                <w:color w:val="000000" w:themeColor="text1"/>
+                                <w:spacing w:val="20"/>
+                                <w:lang w:val="en" w:eastAsia="en-AU"/>
+                              </w:rPr>
+                              <w:t xml:space="preserve"> 2026</w:t>
+                            </w:r>
+                          </w:p>
+                          <w:p>
+                            <w:pPr>
+                              <w:rPr>
+                                <w:rFonts w:ascii="Nordique Pro" w:hAnsi="Nordique Pro"/>
+                                <w:color w:val="2E1A47"/>
+                                <w:sz w:val="100"/>
+                                <w:szCs w:val="100"/>
+                              </w:rPr>
+                            </w:pPr>
+                          </w:p>
+                        </w:txbxContent>
+                      </wps:txbx>
+                      <wps:bodyPr rot="0" spcFirstLastPara="0" vertOverflow="overflow" horzOverflow="overflow" vert="horz" wrap="square" lIns="91440" tIns="45720" rIns="91440" bIns="45720" numCol="1" spcCol="0" rtlCol="0" fromWordArt="0" anchor="t" anchorCtr="0" forceAA="0" compatLnSpc="1">
+                        <a:prstTxWarp prst="textNoShape">
+                          <a:avLst/>
+                        </a:prstTxWarp>
+                        <a:noAutofit/>
+                      </wps:bodyPr>
+                    </wps:wsp>
+                  </a:graphicData>
+                </a:graphic>
+                <wp14:sizeRelH relativeFrom="margin">
+                  <wp14:pctWidth>0</wp14:pctWidth>
+                </wp14:sizeRelH>
+                <wp14:sizeRelV relativeFrom="margin">
+                  <wp14:pctHeight>0</wp14:pctHeight>
+                </wp14:sizeRelV>
+              </wp:anchor>
+            </w:drawing>
+          </mc:Choice>
+          <mc:Fallback>
+            <w:pict>
+              <v:shapetype w14:anchorId="588ACA1B" id="_x0000_t202" coordsize="21600,21600" o:spt="202" path="m,l,21600r21600,l21600,xe">
+                <v:stroke joinstyle="miter"/>
+                <v:path gradientshapeok="t" o:connecttype="rect"/>
+              </v:shapetype>
+              <v:shape id="Text Box 1652917927" o:spid="_x0000_s1026" type="#_x0000_t202" style="position:absolute;margin-left:141.6pt;margin-top:31.9pt;width:594.6pt;height:87.35pt;z-index:251658240;visibility:visible;mso-wrap-style:square;mso-width-percent:0;mso-height-percent:0;mso-wrap-distance-left:9pt;mso-wrap-distance-top:0;mso-wrap-distance-right:9pt;mso-wrap-distance-bottom:0;mso-position-horizontal:absolute;mso-position-horizontal-relative:text;mso-position-vertical:absolute;mso-position-vertical-relative:text;mso-width-percent:0;mso-height-percent:0;mso-width-relative:margin;mso-height-relative:margin;v-text-anchor:top" o:gfxdata="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" filled="f" stroked="f" strokeweight=".5pt">
+                <v:textbox>
+                  <w:txbxContent>
+                    <w:p>
+                      <w:pPr>
+                        <w:spacing w:after="10"/>
+                        <w:jc w:val="right"/>
+                        <w:rPr>
+                          <w:rFonts w:ascii="Arial" w:hAnsi="Arial" w:cs="Arial"/>
+                          <w:color w:val="00B0F0"/>
+                          <w:spacing w:val="20"/>
+                          <w:lang w:val="en" w:eastAsia="en-AU"/>
+                        </w:rPr>
+                      </w:pPr>
+                      <w:r>
+                        <w:rPr>
+                          <w:rFonts w:ascii="Arial" w:hAnsi="Arial" w:cs="Arial"/>
+                          <w:color w:val="948794"/>
+                          <w:sz w:val="90"/>
+                          <w:szCs w:val="90"/>
+                        </w:rPr>
+                        <w:t>Marketing Action Plan</w:t>
+                      </w:r>
+                      <w:r>
+                        <w:rPr>
+                          <w:rFonts w:ascii="Nordique Pro" w:hAnsi="Nordique Pro"/>
+                          <w:color w:val="2E1A47"/>
+                          <w:sz w:val="90"/>
+                          <w:szCs w:val="90"/>
+                        </w:rPr>
+                        <w:br/>
+                      </w:r>
+                      <w:r>
+                        <w:rPr>
+                          <w:rFonts w:ascii="Arial" w:hAnsi="Arial" w:cs="Arial"/>
+                          <w:color w:val="000000" w:themeColor="text1"/>
+                          <w:spacing w:val="20"/>
+                          <w:lang w:val="en" w:eastAsia="en-AU"/>
+                        </w:rPr>
+                        <w:t>April</w:t>
+                      </w:r>
+                      <w:r>
+                        <w:rPr>
+                          <w:rFonts w:ascii="Arial" w:hAnsi="Arial" w:cs="Arial"/>
+                          <w:color w:val="000000" w:themeColor="text1"/>
+                          <w:spacing w:val="20"/>
+                          <w:lang w:val="en" w:eastAsia="en-AU"/>
+                        </w:rPr>
+                        <w:t xml:space="preserve"> 2026</w:t>
+                      </w:r>
+                    </w:p>
+                    <w:p>
+                      <w:pPr>
+                        <w:rPr>
+                          <w:rFonts w:ascii="Nordique Pro" w:hAnsi="Nordique Pro"/>
+                          <w:color w:val="2E1A47"/>
+                          <w:sz w:val="100"/>
+                          <w:szCs w:val="100"/>
+                        </w:rPr>
+                      </w:pPr>
+                    </w:p>
+                  </w:txbxContent>
+                </v:textbox>
+              </v:shape>
+            </w:pict>
+          </mc:Fallback>
+        </mc:AlternateContent>
+      </w:r>
+      <w:bookmarkEnd w:id="0"/>
+    </w:p>
+    <w:p>
+      <w:pPr>
+        <w:sectPr>
+          <w:headerReference w:type="default" r:id="rId13"/>
+          <w:footerReference w:type="default" r:id="rId14"/>
+          <w:pgSz w:w="16838" w:h="11906" w:orient="landscape"/>
+          <w:pgMar w:top="1440" w:right="1440" w:bottom="1440" w:left="1440" w:header="709" w:footer="386" w:gutter="0"/>
+          <w:cols w:space="708"/>
+          <w:docGrid w:linePitch="360"/>
+        </w:sectPr>
+      </w:pPr>
+    </w:p>
+    <w:p>
+      <w:pPr>
+        <w:pStyle w:val="PGHeading1"/>
+      </w:pPr>
+      <w:r>
+        <w:t xml:space="preserve">Marketing Action Plan — Style Reference Template</w:t>
       </w:r>
     </w:p>
     <w:p>
       <w:pPr>
-        <w:pStyle w:val="PGHeading3"/>
+        <w:pStyle w:val="PGBodycopy"/>
       </w:pPr>
       <w:r>
-        <w:t>Audit (PG Heading 3)</w:t>
+        <w:t xml:space="preserve">This is a stripped, style-only reference version of a real Purple Giraffe Marketing Action Plan. All client-specific content (business detail, audit findings, SWOT, competitor analysis, KPI targets, personas) has been removed. What remains demonstrates every named paragraph, heading, table, and callout-box style used in a real delivered MAP, plus the page header/footer and cover layout. Do not send this file to a client — use it only as a formatting reference when building a new MAP.</w:t>
       </w:r>
     </w:p>
     <w:p>
@@ -55,54 +475,92 @@
         <w:pStyle w:val="PGBodycopy"/>
       </w:pPr>
       <w:r>
-        <w:t>Example placeholder text demonstrating PG Body copy — the current-state audit paragraph style. Replace with real, evidence-backed findings for the actual client.</w:t>
+        <w:t xml:space="preserve">[Client Name] | Marketing Action Plan | [Month Year]</w:t>
       </w:r>
     </w:p>
     <w:p>
       <w:pPr>
-        <w:pStyle w:val="PGHeading3"/>
+        <w:pStyle w:val="PGHeading1"/>
       </w:pPr>
       <w:r>
-        <w:t>Strategy (PG Heading 3)</w:t>
+        <w:t xml:space="preserve">Example Section (PG Heading 1)</w:t>
       </w:r>
     </w:p>
     <w:p>
       <w:pPr>
-        <w:pStyle w:val="PGBodycopy"/>
+        <w:pStyle w:val="PGHeading2"/>
       </w:pPr>
       <w:r>
-        <w:t>Example placeholder text demonstrating PG Body copy used for the Strategy paragraph — the recommended direction, not a task list.</w:t>
+        <w:t xml:space="preserve">Example Subsection (PG Heading 2)</w:t>
       </w:r>
     </w:p>
     <w:p>
       <w:pPr>
-        <w:pStyle w:val="PGBullets"/>
+        <w:pStyle w:val="PGHeading3"/>
       </w:pPr>
       <w:r>
-        <w:t>Example standard bullet one (PG Bullets)</w:t>
+        <w:t xml:space="preserve">Audit</w:t>
       </w:r>
     </w:p>
     <w:p>
       <w:pPr>
+        <w:pStyle w:val="PGBodycopy"/>
+      </w:pPr>
+      <w:r>
+        <w:t xml:space="preserve">Example placeholder text demonstrating PG Body copy — the current-state audit paragraph style. Replace with real, evidence-backed findings for the actual client.</w:t>
+      </w:r>
+    </w:p>
+    <w:p>
+      <w:pPr>
+        <w:pStyle w:val="PGHeading3"/>
+      </w:pPr>
+      <w:r>
+        <w:t xml:space="preserve">Strategy</w:t>
+      </w:r>
+    </w:p>
+    <w:p>
+      <w:pPr>
+        <w:pStyle w:val="PGBodycopy"/>
+      </w:pPr>
+      <w:r>
+        <w:t xml:space="preserve">Example placeholder text demonstrating PG Body copy used for the Strategy paragraph — the recommended direction, not a task list.</w:t>
+      </w:r>
+    </w:p>
+    <w:p>
+      <w:pPr>
         <w:pStyle w:val="PGBullets"/>
       </w:pPr>
       <w:r>
-        <w:t>Example standard bullet two</w:t>
+        <w:t xml:space="preserve">Example standard bullet one (PG Bullets)</w:t>
+      </w:r>
+    </w:p>
+    <w:p>
+      <w:pPr>
+        <w:pStyle w:val="PGBullets"/>
+      </w:pPr>
+      <w:r>
+        <w:t xml:space="preserve">Example standard bullet two</w:t>
       </w:r>
     </w:p>
     <w:tbl>
       <w:tblPr>
         <w:tblStyle w:val="TableGrid"/>
-        <w:tblW w:type="auto" w:w="0"/>
-        <w:tblLook w:firstColumn="1" w:firstRow="1" w:lastColumn="0" w:lastRow="0" w:noHBand="0" w:noVBand="1" w:val="04A0"/>
+        <w:tblW w:w="14170" w:type="dxa"/>
+        <w:tblBorders>
+          <w:top w:val="single" w:sz="4" w:space="0" w:color="EAE8ED"/>
+          <w:left w:val="single" w:sz="4" w:space="0" w:color="EAE8ED"/>
+          <w:bottom w:val="single" w:sz="4" w:space="0" w:color="EAE8ED"/>
+          <w:right w:val="single" w:sz="4" w:space="0" w:color="EAE8ED"/>
+        </w:tblBorders>
+        <w:tblLook w:val="04A0"/>
       </w:tblPr>
       <w:tblGrid>
-        <w:gridCol w:w="13958"/>
+        <w:gridCol w:w="14170"/>
       </w:tblGrid>
       <w:tr>
         <w:tc>
           <w:tcPr>
-            <w:tcW w:type="dxa" w:w="13958"/>
+            <w:tcW w:w="14170" w:type="dxa"/>
             <w:shd w:val="clear" w:color="auto" w:fill="EAE8ED"/>
           </w:tcPr>
           <w:p>
@@ -110,7 +568,7 @@
               <w:pStyle w:val="PGAction"/>
             </w:pPr>
             <w:r>
-              <w:t>Example actions (PG Action heading)</w:t>
+              <w:t xml:space="preserve">Example actions (PG Action heading)</w:t>
             </w:r>
           </w:p>
           <w:p>
@@ -118,7 +576,7 @@
               <w:pStyle w:val="PGActionbullets"/>
             </w:pPr>
             <w:r>
-              <w:t>Example action bullet one (PG Action bullets)</w:t>
+              <w:t xml:space="preserve">Example action bullet one (PG Action bullets)</w:t>
             </w:r>
           </w:p>
           <w:p>
@@ -126,29 +584,41 @@
               <w:pStyle w:val="PGActionbullets"/>
             </w:pPr>
             <w:r>
-              <w:t>Example action bullet two</w:t>
+              <w:t xml:space="preserve">Example action bullet two</w:t>
             </w:r>
           </w:p>
         </w:tc>
       </w:tr>
     </w:tbl>
-    <w:p/>
+    <w:p>
+      <w:pPr>
+        <w:pStyle w:val="PGBodycopy"/>
+      </w:pPr>
+    </w:p>
     <w:tbl>
       <w:tblPr>
         <w:tblStyle w:val="TableGrid"/>
-        <w:tblW w:type="auto" w:w="0"/>
-        <w:tblLook w:firstColumn="1" w:firstRow="1" w:lastColumn="0" w:lastRow="0" w:noHBand="0" w:noVBand="1" w:val="04A0"/>
+        <w:tblW w:w="14170" w:type="dxa"/>
+        <w:tblBorders>
+          <w:top w:val="single" w:sz="4" w:space="0" w:color="EAE8ED"/>
+          <w:left w:val="single" w:sz="4" w:space="0" w:color="EAE8ED"/>
+          <w:bottom w:val="single" w:sz="4" w:space="0" w:color="EAE8ED"/>
+          <w:right w:val="single" w:sz="4" w:space="0" w:color="EAE8ED"/>
+          <w:insideH w:val="single" w:sz="4" w:space="0" w:color="EAE8ED"/>
+          <w:insideV w:val="single" w:sz="4" w:space="0" w:color="EAE8ED"/>
+        </w:tblBorders>
+        <w:tblLook w:val="04A0"/>
       </w:tblPr>
       <w:tblGrid>
-        <w:gridCol w:w="3489"/>
-        <w:gridCol w:w="3489"/>
-        <w:gridCol w:w="3489"/>
-        <w:gridCol w:w="3489"/>
+        <w:gridCol w:w="3542"/>
+        <w:gridCol w:w="3542"/>
+        <w:gridCol w:w="3542"/>
+        <w:gridCol w:w="3542"/>
       </w:tblGrid>
       <w:tr>
         <w:tc>
           <w:tcPr>
-            <w:tcW w:type="dxa" w:w="3489"/>
+            <w:tcW w:w="3542" w:type="dxa"/>
             <w:shd w:val="clear" w:color="auto" w:fill="2E1A47"/>
           </w:tcPr>
           <w:p>
@@ -156,13 +626,13 @@
               <w:pStyle w:val="PGTableheading"/>
             </w:pPr>
             <w:r>
-              <w:t>Key Performance Indicator</w:t>
+              <w:t xml:space="preserve">Key Performance Indicator</w:t>
             </w:r>
           </w:p>
         </w:tc>
         <w:tc>
           <w:tcPr>
-            <w:tcW w:type="dxa" w:w="3489"/>
+            <w:tcW w:w="3542" w:type="dxa"/>
             <w:shd w:val="clear" w:color="auto" w:fill="2E1A47"/>
           </w:tcPr>
           <w:p>
@@ -170,13 +640,13 @@
               <w:pStyle w:val="PGTableheading"/>
             </w:pPr>
             <w:r>
-              <w:t>Current result</w:t>
+              <w:t xml:space="preserve">Current result</w:t>
             </w:r>
           </w:p>
         </w:tc>
         <w:tc>
           <w:tcPr>
-            <w:tcW w:type="dxa" w:w="3489"/>
+            <w:tcW w:w="3542" w:type="dxa"/>
             <w:shd w:val="clear" w:color="auto" w:fill="2E1A47"/>
           </w:tcPr>
           <w:p>
@@ -184,13 +654,13 @@
               <w:pStyle w:val="PGTableheading"/>
             </w:pPr>
             <w:r>
-              <w:t>Desired result</w:t>
+              <w:t xml:space="preserve">Desired result</w:t>
             </w:r>
           </w:p>
         </w:tc>
         <w:tc>
           <w:tcPr>
-            <w:tcW w:type="dxa" w:w="3489"/>
+            <w:tcW w:w="3542" w:type="dxa"/>
             <w:shd w:val="clear" w:color="auto" w:fill="2E1A47"/>
           </w:tcPr>
           <w:p>
@@ -198,7 +668,7 @@
               <w:pStyle w:val="PGTableheading"/>
             </w:pPr>
             <w:r>
-              <w:t>Comments</w:t>
+              <w:t xml:space="preserve">Comments</w:t>
             </w:r>
           </w:p>
         </w:tc>
@@ -206,77 +676,89 @@
       <w:tr>
         <w:tc>
           <w:tcPr>
-            <w:tcW w:type="dxa" w:w="3489"/>
+            <w:tcW w:w="3542" w:type="dxa"/>
           </w:tcPr>
           <w:p>
             <w:pPr>
               <w:pStyle w:val="PGTabletext"/>
             </w:pPr>
             <w:r>
-              <w:t>Example metric</w:t>
+              <w:t xml:space="preserve">Example metric</w:t>
             </w:r>
           </w:p>
         </w:tc>
         <w:tc>
           <w:tcPr>
-            <w:tcW w:type="dxa" w:w="3489"/>
+            <w:tcW w:w="3542" w:type="dxa"/>
           </w:tcPr>
           <w:p>
             <w:pPr>
               <w:pStyle w:val="PGTabletext"/>
             </w:pPr>
             <w:r>
-              <w:t>Baseline to be established</w:t>
+              <w:t xml:space="preserve">Baseline to be established</w:t>
             </w:r>
           </w:p>
         </w:tc>
         <w:tc>
           <w:tcPr>
-            <w:tcW w:type="dxa" w:w="3489"/>
+            <w:tcW w:w="3542" w:type="dxa"/>
           </w:tcPr>
           <w:p>
             <w:pPr>
               <w:pStyle w:val="PGTabletext"/>
             </w:pPr>
             <w:r>
-              <w:t>TBC</w:t>
+              <w:t xml:space="preserve">TBC</w:t>
             </w:r>
           </w:p>
         </w:tc>
         <w:tc>
           <w:tcPr>
-            <w:tcW w:type="dxa" w:w="3489"/>
+            <w:tcW w:w="3542" w:type="dxa"/>
           </w:tcPr>
           <w:p>
             <w:pPr>
               <w:pStyle w:val="PGTabletext"/>
             </w:pPr>
             <w:r>
-              <w:t>Example comment</w:t>
+              <w:t xml:space="preserve">Example comment</w:t>
             </w:r>
           </w:p>
         </w:tc>
       </w:tr>
     </w:tbl>
-    <w:p/>
+    <w:p>
+      <w:pPr>
+        <w:pStyle w:val="PGBodycopy"/>
+      </w:pPr>
+    </w:p>
     <w:tbl>
       <w:tblPr>
         <w:tblStyle w:val="TableGrid"/>
-        <w:tblW w:type="auto" w:w="0"/>
-        <w:tblLook w:firstColumn="1" w:firstRow="1" w:lastColumn="0" w:lastRow="0" w:noHBand="0" w:noVBand="1" w:val="04A0"/>
+        <w:tblW w:w="14170" w:type="dxa"/>
+        <w:tblBorders>
+          <w:top w:val="single" w:sz="4" w:space="0" w:color="EAE8ED"/>
+          <w:left w:val="single" w:sz="4" w:space="0" w:color="EAE8ED"/>
+          <w:bottom w:val="single" w:sz="4" w:space="0" w:color="EAE8ED"/>
+          <w:right w:val="single" w:sz="4" w:space="0" w:color="EAE8ED"/>
+          <w:insideH w:val="single" w:sz="4" w:space="0" w:color="EAE8ED"/>
+          <w:insideV w:val="single" w:sz="4" w:space="0" w:color="EAE8ED"/>
+        </w:tblBorders>
+        <w:tblLook w:val="04A0"/>
       </w:tblPr>
       <w:tblGrid>
-        <w:gridCol w:w="2326"/>
-        <w:gridCol w:w="2326"/>
-        <w:gridCol w:w="2326"/>
-        <w:gridCol w:w="2326"/>
-        <w:gridCol w:w="2326"/>
-        <w:gridCol w:w="2326"/>
+        <w:gridCol w:w="2361"/>
+        <w:gridCol w:w="2361"/>
+        <w:gridCol w:w="2361"/>
+        <w:gridCol w:w="2361"/>
+        <w:gridCol w:w="2361"/>
+        <w:gridCol w:w="2361"/>
       </w:tblGrid>
       <w:tr>
         <w:tc>
           <w:tcPr>
-            <w:tcW w:type="dxa" w:w="2326"/>
+            <w:tcW w:w="2361" w:type="dxa"/>
             <w:shd w:val="clear" w:color="auto" w:fill="2E1A47"/>
           </w:tcPr>
           <w:p>
@@ -284,13 +766,13 @@
               <w:pStyle w:val="PGTableheading"/>
             </w:pPr>
             <w:r>
-              <w:t>Marketing Element</w:t>
+              <w:t xml:space="preserve">Marketing Element</w:t>
             </w:r>
           </w:p>
         </w:tc>
         <w:tc>
           <w:tcPr>
-            <w:tcW w:type="dxa" w:w="2326"/>
+            <w:tcW w:w="2361" w:type="dxa"/>
             <w:shd w:val="clear" w:color="auto" w:fill="2E1A47"/>
           </w:tcPr>
           <w:p>
@@ -298,13 +780,13 @@
               <w:pStyle w:val="PGTableheading"/>
             </w:pPr>
             <w:r>
-              <w:t>Activity</w:t>
+              <w:t xml:space="preserve">Activity</w:t>
             </w:r>
           </w:p>
         </w:tc>
         <w:tc>
           <w:tcPr>
-            <w:tcW w:type="dxa" w:w="2326"/>
+            <w:tcW w:w="2361" w:type="dxa"/>
             <w:shd w:val="clear" w:color="auto" w:fill="2E1A47"/>
           </w:tcPr>
           <w:p>
@@ -312,13 +794,13 @@
               <w:pStyle w:val="PGTableheading"/>
             </w:pPr>
             <w:r>
-              <w:t>Who</w:t>
+              <w:t xml:space="preserve">Who</w:t>
             </w:r>
           </w:p>
         </w:tc>
         <w:tc>
           <w:tcPr>
-            <w:tcW w:type="dxa" w:w="2326"/>
+            <w:tcW w:w="2361" w:type="dxa"/>
             <w:shd w:val="clear" w:color="auto" w:fill="2E1A47"/>
           </w:tcPr>
           <w:p>
@@ -326,13 +808,13 @@
               <w:pStyle w:val="PGTableheading"/>
             </w:pPr>
             <w:r>
-              <w:t>Qtr 1</w:t>
+              <w:t xml:space="preserve">Qtr 1</w:t>
             </w:r>
           </w:p>
         </w:tc>
         <w:tc>
           <w:tcPr>
-            <w:tcW w:type="dxa" w:w="2326"/>
+            <w:tcW w:w="2361" w:type="dxa"/>
             <w:shd w:val="clear" w:color="auto" w:fill="2E1A47"/>
           </w:tcPr>
           <w:p>
@@ -340,13 +822,13 @@
               <w:pStyle w:val="PGTableheading"/>
             </w:pPr>
             <w:r>
-              <w:t>Qtr 2</w:t>
+              <w:t xml:space="preserve">Qtr 2</w:t>
             </w:r>
           </w:p>
         </w:tc>
         <w:tc>
           <w:tcPr>
-            <w:tcW w:type="dxa" w:w="2326"/>
+            <w:tcW w:w="2361" w:type="dxa"/>
             <w:shd w:val="clear" w:color="auto" w:fill="2E1A47"/>
           </w:tcPr>
           <w:p>
@@ -354,7 +836,7 @@
               <w:pStyle w:val="PGTableheading"/>
             </w:pPr>
             <w:r>
-              <w:t>Qtr 3</w:t>
+              <w:t xml:space="preserve">Qtr 3</w:t>
             </w:r>
           </w:p>
         </w:tc>
@@ -362,86 +844,89 @@
       <w:tr>
         <w:tc>
           <w:tcPr>
-            <w:tcW w:type="dxa" w:w="2326"/>
+            <w:tcW w:w="2361" w:type="dxa"/>
           </w:tcPr>
           <w:p>
             <w:pPr>
               <w:pStyle w:val="PGTabletext"/>
             </w:pPr>
             <w:r>
-              <w:t>Example channel</w:t>
+              <w:t xml:space="preserve">Example channel</w:t>
             </w:r>
           </w:p>
         </w:tc>
         <w:tc>
           <w:tcPr>
-            <w:tcW w:type="dxa" w:w="2326"/>
+            <w:tcW w:w="2361" w:type="dxa"/>
           </w:tcPr>
           <w:p>
             <w:pPr>
               <w:pStyle w:val="PGTabletext"/>
             </w:pPr>
             <w:r>
-              <w:t>Example activity description</w:t>
+              <w:t xml:space="preserve">Example activity description</w:t>
             </w:r>
           </w:p>
         </w:tc>
         <w:tc>
           <w:tcPr>
-            <w:tcW w:type="dxa" w:w="2326"/>
+            <w:tcW w:w="2361" w:type="dxa"/>
           </w:tcPr>
           <w:p>
             <w:pPr>
               <w:pStyle w:val="PGTabletext"/>
             </w:pPr>
             <w:r>
-              <w:t>PG</w:t>
+              <w:t xml:space="preserve">PG</w:t>
             </w:r>
           </w:p>
         </w:tc>
         <w:tc>
           <w:tcPr>
-            <w:tcW w:type="dxa" w:w="2326"/>
-            <w:shd w:val="clear" w:color="auto" w:fill="C9C0D3"/>
+            <w:tcW w:w="2361" w:type="dxa"/>
           </w:tcPr>
           <w:p>
             <w:pPr>
               <w:pStyle w:val="PGTabletext"/>
             </w:pPr>
-            <w:r/>
+            <w:r>
+              <w:t xml:space="preserve">X</w:t>
+            </w:r>
           </w:p>
         </w:tc>
         <w:tc>
           <w:tcPr>
-            <w:tcW w:type="dxa" w:w="2326"/>
+            <w:tcW w:w="2361" w:type="dxa"/>
           </w:tcPr>
           <w:p>
             <w:pPr>
               <w:pStyle w:val="PGTabletext"/>
             </w:pPr>
-            <w:r/>
           </w:p>
         </w:tc>
         <w:tc>
           <w:tcPr>
-            <w:tcW w:type="dxa" w:w="2326"/>
+            <w:tcW w:w="2361" w:type="dxa"/>
           </w:tcPr>
           <w:p>
             <w:pPr>
               <w:pStyle w:val="PGTabletext"/>
             </w:pPr>
-            <w:r/>
           </w:p>
         </w:tc>
       </w:tr>
     </w:tbl>
-    <w:p/>
     <w:p>
       <w:pPr>
+        <w:pStyle w:val="PGBodycopy"/>
+      </w:pPr>
+    </w:p>
+    <w:p>
+      <w:pPr>
         <w:pStyle w:val="PGHeading1"/>
       </w:pPr>
       <w:r>
-        <w:t>Appendix 1 (PG Heading 1 example)</w:t>
+        <w:t xml:space="preserve">Appendix 1 (PG Heading 1 example)</w:t>
       </w:r>
     </w:p>
     <w:p>
@@ -449,13 +934,14 @@
         <w:pStyle w:val="PGBodycopy"/>
       </w:pPr>
       <w:r>
-        <w:t>Example placeholder appendix content.</w:t>
+        <w:t xml:space="preserve">Example placeholder appendix content.</w:t>
       </w:r>
     </w:p>
     <w:sectPr>
-      <w:footerReference w:type="default" r:id="rId17"/>
+      <w:footerReference w:type="default" r:id="rId14"/>
+      <w:headerReference w:type="default" r:id="rId16"/>
       <w:pgSz w:w="16838" w:h="11906" w:orient="landscape"/>
-      <w:pgMar w:top="1440" w:right="1440" w:bottom="1440" w:left="1440" w:header="708" w:footer="708" w:gutter="0"/>
+      <w:pgMar w:top="1440" w:right="1440" w:bottom="1368" w:left="1440" w:header="709" w:footer="176" w:gutter="0"/>
       <w:cols w:space="708"/>
       <w:docGrid w:linePitch="360"/>
     </w:sectPr>

</xml_diff>